<commit_message>
docs: actualizar bibliografía con documentación de PostgreSQL
</commit_message>
<xml_diff>
--- a/docs/informe/APF2_Desarrollo_Web_Integrado_Mathias_Herrera_60618.docx
+++ b/docs/informe/APF2_Desarrollo_Web_Integrado_Mathias_Herrera_60618.docx
@@ -14022,7 +14022,7 @@
         <w:rPr>
           <w:b w:val="0"/>
         </w:rPr>
-        <w:t>EDUDEV2004. Intranet Distribución Backend [repositorio en línea]. Código de origen compartido. Disponible en:</w:t>
+        <w:t>POSTGRESQL GLOBAL DEVELOPMENT GROUP. Transactions [en línea]. Disponible en:</w:t>
       </w:r>
     </w:p>
     <w:p>
@@ -14034,7 +14034,7 @@
           <w:rPr>
             <w:color w:val="000000"/>
           </w:rPr>
-          <w:t>https://github.com/Edudev2004/intranet-distribucion-back</w:t>
+          <w:t>https://www.postgresql.org/docs/17/tutorial-transactions.html</w:t>
         </w:r>
       </w:hyperlink>
     </w:p>

</xml_diff>